<commit_message>
pending: crypto module implementation
</commit_message>
<xml_diff>
--- a/docs/JsonT.docx
+++ b/docs/JsonT.docx
@@ -7756,6 +7756,427 @@
       </w:r>
     </w:p>
     <w:p/>
+    <w:p>
+      <w:pPr>
+        <w:pStyle w:val="Heading1"/>
+      </w:pPr>
+      <w:r>
+        <w:t>Privacy &amp; Encryption</w:t>
+      </w:r>
+    </w:p>
+    <w:p>
+      <w:pPr>
+        <w:pStyle w:val="Heading2"/>
+      </w:pPr>
+      <w:r>
+        <w:t>Sensitive fields (~)</w:t>
+      </w:r>
+    </w:p>
+    <w:p>
+      <w:r>
+        <w:t>Prefix a scalar field type with ~ to mark it as privacy-sensitive. The field is encrypted to a base64:&lt;b64&gt; wire token on write and travels as an opaque Encrypted value through the pipeline.</w:t>
+      </w:r>
+    </w:p>
+    <w:p>
+      <w:pPr/>
+      <w:r>
+        <w:rPr>
+          <w:rFonts w:ascii="Courier New" w:hAnsi="Courier New"/>
+          <w:color w:val="202020"/>
+          <w:sz w:val="18"/>
+        </w:rPr>
+        <w:t>Person: {</w:t>
+        <w:br/>
+        <w:t xml:space="preserve">  fields: {</w:t>
+        <w:br/>
+        <w:t xml:space="preserve">    str:  name,</w:t>
+        <w:br/>
+        <w:t xml:space="preserve">    ~str: ssn,          // encrypted on wire</w:t>
+        <w:br/>
+        <w:t xml:space="preserve">    ~str: cardNumber?   // optional, encrypted when present</w:t>
+        <w:br/>
+        <w:t xml:space="preserve">  }</w:t>
+        <w:br/>
+        <w:t>}</w:t>
+      </w:r>
+    </w:p>
+    <w:p>
+      <w:pPr>
+        <w:pStyle w:val="Heading2"/>
+      </w:pPr>
+      <w:r>
+        <w:t>Wire format</w:t>
+      </w:r>
+    </w:p>
+    <w:p>
+      <w:r>
+        <w:t>Encrypted fields are serialised as a JSON string prefixed with base64: followed by the Base64-encoded ciphertext bytes produced by CryptoConfig.encrypt().</w:t>
+      </w:r>
+    </w:p>
+    <w:p>
+      <w:pPr/>
+      <w:r>
+        <w:rPr>
+          <w:rFonts w:ascii="Courier New" w:hAnsi="Courier New"/>
+          <w:color w:val="202020"/>
+          <w:sz w:val="18"/>
+        </w:rPr>
+        <w:t>"base64:SGVsbG8gV29ybGQ="</w:t>
+      </w:r>
+    </w:p>
+    <w:p>
+      <w:r>
+        <w:t>When reading, a base64:... string at a sensitive-field position is parsed directly into an Encrypted value — no decryption occurs at parse time.</w:t>
+      </w:r>
+    </w:p>
+    <w:p>
+      <w:pPr>
+        <w:pStyle w:val="Heading2"/>
+      </w:pPr>
+      <w:r>
+        <w:t>Decrypt operation (derived schemas)</w:t>
+      </w:r>
+    </w:p>
+    <w:p>
+      <w:r>
+        <w:t>The decrypt(field1, field2, ...) derived-schema operation decrypts named fields inline during transform. It requires a CryptoConfig at runtime and is idempotent — already-plaintext fields are left unchanged.</w:t>
+      </w:r>
+    </w:p>
+    <w:p>
+      <w:pPr/>
+      <w:r>
+        <w:rPr>
+          <w:rFonts w:ascii="Courier New" w:hAnsi="Courier New"/>
+          <w:color w:val="202020"/>
+          <w:sz w:val="18"/>
+        </w:rPr>
+        <w:t>PersonDecrypted: FROM Person {</w:t>
+        <w:br/>
+        <w:t xml:space="preserve">  operations: (</w:t>
+        <w:br/>
+        <w:t xml:space="preserve">    decrypt(ssn, cardNumber)</w:t>
+        <w:br/>
+        <w:t xml:space="preserve">  )</w:t>
+        <w:br/>
+        <w:t>}</w:t>
+      </w:r>
+    </w:p>
+    <w:p>
+      <w:r>
+        <w:t>Calling transform() without a CryptoConfig when a decrypt operation is present returns TransformError::DecryptFailed (Rust) or throws JsonTError.Transform.DecryptFailed (Java).</w:t>
+      </w:r>
+    </w:p>
+    <w:p>
+      <w:pPr>
+        <w:pStyle w:val="Heading2"/>
+      </w:pPr>
+      <w:r>
+        <w:t>On-demand decryption API</w:t>
+      </w:r>
+    </w:p>
+    <w:p>
+      <w:r>
+        <w:t>Individual values and rows expose a decrypt API for cases where a full pipeline decrypt operation is unnecessary:</w:t>
+      </w:r>
+    </w:p>
+    <w:p>
+      <w:r>
+        <w:t>value.decrypt_str(fieldName, crypto)  → Option&lt;String&gt; / Optional&lt;String&gt;</w:t>
+      </w:r>
+    </w:p>
+    <w:p>
+      <w:r>
+        <w:t>value.decrypt_str(fieldName, crypto)  → Option&lt;String&gt; / Optional&lt;String&gt;</w:t>
+      </w:r>
+    </w:p>
+    <w:p>
+      <w:r>
+        <w:t>value.decrypt_bytes(fieldName, crypto) → Option&lt;Vec&lt;u8&gt;&gt; / Optional&lt;byte[]&gt;</w:t>
+      </w:r>
+    </w:p>
+    <w:p>
+      <w:r>
+        <w:t>value.decrypt_bytes(fieldName, crypto) → Option&lt;Vec&lt;u8&gt;&gt; / Optional&lt;byte[]&gt;</w:t>
+      </w:r>
+    </w:p>
+    <w:p>
+      <w:r>
+        <w:t>row.decrypt_field_str(index, fieldName, crypto)  (Rust) → Option&lt;String&gt;</w:t>
+      </w:r>
+    </w:p>
+    <w:p>
+      <w:r>
+        <w:t>row.decrypt_field_str(index, fieldName, crypto)  (Rust) → Option&lt;String&gt;</w:t>
+      </w:r>
+    </w:p>
+    <w:p>
+      <w:r>
+        <w:t>row.decryptField(index, fieldName, crypto)  (Java) → Optional&lt;String&gt;</w:t>
+      </w:r>
+    </w:p>
+    <w:p>
+      <w:r>
+        <w:t>row.decryptField(index, fieldName, crypto)  (Java) → Optional&lt;String&gt;</w:t>
+      </w:r>
+    </w:p>
+    <w:p>
+      <w:r>
+        <w:t>All methods return None / Optional.empty() for non-encrypted values, making them safe to call without first inspecting the value type.</w:t>
+      </w:r>
+    </w:p>
+    <w:p>
+      <w:pPr>
+        <w:pStyle w:val="Heading2"/>
+      </w:pPr>
+      <w:r>
+        <w:t>CryptoConfig interface</w:t>
+      </w:r>
+    </w:p>
+    <w:p>
+      <w:r>
+        <w:t>CryptoConfig is a pluggable, implementation-agnostic interface. The field name is passed to both encrypt and decrypt to support per-field or per-field-type key strategies.</w:t>
+      </w:r>
+    </w:p>
+    <w:p>
+      <w:pPr/>
+      <w:r>
+        <w:rPr>
+          <w:rFonts w:ascii="Courier New" w:hAnsi="Courier New"/>
+          <w:color w:val="202020"/>
+          <w:sz w:val="18"/>
+        </w:rPr>
+        <w:t>// Rust</w:t>
+        <w:br/>
+        <w:t>trait CryptoConfig {</w:t>
+        <w:br/>
+        <w:t xml:space="preserve">    fn encrypt(&amp;self, field: &amp;str, plaintext: &amp;[u8]) -&gt; Result&lt;Vec&lt;u8&gt;, CryptoError&gt;;</w:t>
+        <w:br/>
+        <w:t xml:space="preserve">    fn decrypt(&amp;self, field: &amp;str, ciphertext: &amp;[u8]) -&gt; Result&lt;Vec&lt;u8&gt;, CryptoError&gt;;</w:t>
+        <w:br/>
+        <w:t>}</w:t>
+      </w:r>
+    </w:p>
+    <w:p>
+      <w:pPr/>
+      <w:r>
+        <w:rPr>
+          <w:rFonts w:ascii="Courier New" w:hAnsi="Courier New"/>
+          <w:color w:val="202020"/>
+          <w:sz w:val="18"/>
+        </w:rPr>
+        <w:t>// Java</w:t>
+        <w:br/>
+        <w:t>interface CryptoConfig {</w:t>
+        <w:br/>
+        <w:t xml:space="preserve">    byte[] encrypt(String field, byte[] plaintext) throws CryptoError;</w:t>
+        <w:br/>
+        <w:t xml:space="preserve">    byte[] decrypt(String field, byte[] ciphertext) throws CryptoError;</w:t>
+        <w:br/>
+        <w:t>}</w:t>
+      </w:r>
+    </w:p>
+    <w:p>
+      <w:r>
+        <w:t>PassthroughCryptoConfig is the built-in identity implementation (bytes in = bytes out) — useful for testing.</w:t>
+      </w:r>
+    </w:p>
+    <w:p>
+      <w:pPr>
+        <w:pStyle w:val="Heading1"/>
+      </w:pPr>
+      <w:r>
+        <w:t>Applications</w:t>
+      </w:r>
+    </w:p>
+    <w:p>
+      <w:r>
+        <w:t>JsonT is a general-purpose data contract format. The following domains have been modelled using JsonT schemas included in this repository.</w:t>
+      </w:r>
+    </w:p>
+    <w:p>
+      <w:pPr>
+        <w:pStyle w:val="Heading2"/>
+      </w:pPr>
+      <w:r>
+        <w:t>Fintech &amp; Payments</w:t>
+      </w:r>
+    </w:p>
+    <w:p>
+      <w:r>
+        <w:t>ISO 20022 (pain.001) — Payment initiation with IBAN regex validation, currency code constraints, and hierarchical party/agent structures.</w:t>
+      </w:r>
+    </w:p>
+    <w:p>
+      <w:r>
+        <w:t>ISO 20022 (pain.001) — Payment initiation with IBAN regex validation, currency code constraints, and hierarchical party/agent structures.</w:t>
+      </w:r>
+    </w:p>
+    <w:p>
+      <w:r>
+        <w:t>NACHA / ACH — US Automated Clearing House files with record-type constant checks and fixed-length field constraints.</w:t>
+      </w:r>
+    </w:p>
+    <w:p>
+      <w:r>
+        <w:t>NACHA / ACH — US Automated Clearing House files with record-type constant checks and fixed-length field constraints.</w:t>
+      </w:r>
+    </w:p>
+    <w:p>
+      <w:r>
+        <w:t>FIX Protocol — Trading messages with conditional requirements (e.g. ordType == "2" -&gt; required(price)) and standard tag mapping.</w:t>
+      </w:r>
+    </w:p>
+    <w:p>
+      <w:r>
+        <w:t>FIX Protocol — Trading messages with conditional requirements (e.g. ordType == "2" -&gt; required(price)) and standard tag mapping.</w:t>
+      </w:r>
+    </w:p>
+    <w:p>
+      <w:pPr>
+        <w:pStyle w:val="Heading2"/>
+      </w:pPr>
+      <w:r>
+        <w:t>Healthcare</w:t>
+      </w:r>
+    </w:p>
+    <w:p>
+      <w:r>
+        <w:t>HL7 834 (Benefit Enrollment) — ISA, ST, BGN, INS, REF, DTP, NM1, DMG, HD segments with loop hierarchies (1000A/B, 2000, 2300) and X12 code-set enums.</w:t>
+      </w:r>
+    </w:p>
+    <w:p>
+      <w:r>
+        <w:t>HL7 834 (Benefit Enrollment) — ISA, ST, BGN, INS, REF, DTP, NM1, DMG, HD segments with loop hierarchies (1000A/B, 2000, 2300) and X12 code-set enums.</w:t>
+      </w:r>
+    </w:p>
+    <w:p>
+      <w:r>
+        <w:t>Sensitive PII fields (SSNs, member IDs) can be marked with ~ and encrypted at the field level without changing the positional row format.</w:t>
+      </w:r>
+    </w:p>
+    <w:p>
+      <w:pPr>
+        <w:pStyle w:val="Heading2"/>
+      </w:pPr>
+      <w:r>
+        <w:t>Analytics &amp; Data Pipelines</w:t>
+      </w:r>
+    </w:p>
+    <w:p>
+      <w:r>
+        <w:t>Batch API responses — 45–55% smaller than equivalent JSON for large record sets.</w:t>
+      </w:r>
+    </w:p>
+    <w:p>
+      <w:r>
+        <w:t>Batch API responses — 45–55% smaller than equivalent JSON for large record sets.</w:t>
+      </w:r>
+    </w:p>
+    <w:p>
+      <w:r>
+        <w:t>Event streams and logs — O(1) streaming validation with no memory growth.</w:t>
+      </w:r>
+    </w:p>
+    <w:p>
+      <w:r>
+        <w:t>Event streams and logs — O(1) streaming validation with no memory growth.</w:t>
+      </w:r>
+    </w:p>
+    <w:p>
+      <w:r>
+        <w:t>Analytics exports — Schema-enforced types prevent downstream type coercion errors.</w:t>
+      </w:r>
+    </w:p>
+    <w:p>
+      <w:r>
+        <w:t>Analytics exports — Schema-enforced types prevent downstream type coercion errors.</w:t>
+      </w:r>
+    </w:p>
+    <w:p>
+      <w:r>
+        <w:t>Data lakehouse ingestion — Derived schemas project and filter rows in-flight.</w:t>
+      </w:r>
+    </w:p>
+    <w:p>
+      <w:r>
+        <w:t>Data lakehouse ingestion — Derived schemas project and filter rows in-flight.</w:t>
+      </w:r>
+    </w:p>
+    <w:p>
+      <w:pPr>
+        <w:pStyle w:val="Heading2"/>
+      </w:pPr>
+      <w:r>
+        <w:t>Multi-system Integration</w:t>
+      </w:r>
+    </w:p>
+    <w:p>
+      <w:r>
+        <w:t>Derived schemas let a single canonical schema (e.g. Order) fan out to multiple consumers through typed projections — each consumer receives only the fields it needs, validated against the original schema.</w:t>
+      </w:r>
+    </w:p>
+    <w:p>
+      <w:pPr/>
+      <w:r>
+        <w:rPr>
+          <w:rFonts w:ascii="Courier New" w:hAnsi="Courier New"/>
+          <w:color w:val="202020"/>
+          <w:sz w:val="18"/>
+        </w:rPr>
+        <w:t>Order (Straight): id, product, quantity, price, customerId, internalCost</w:t>
+        <w:br/>
+        <w:t xml:space="preserve">  └─ OrderPublic (Derived):   project(id, product, price)     → 3 fields</w:t>
+        <w:br/>
+        <w:t xml:space="preserve">  └─ OrderBilling (Derived):  exclude(internalCost)           → 5 fields</w:t>
+        <w:br/>
+        <w:t xml:space="preserve">  └─ OrderAnalytics (Derived): rename(customerId as cid), ...</w:t>
+        <w:br/>
+        <w:t xml:space="preserve">                               filter price &gt; 0</w:t>
+      </w:r>
+    </w:p>
+    <w:p>
+      <w:pPr>
+        <w:pStyle w:val="Heading2"/>
+      </w:pPr>
+      <w:r>
+        <w:t>Privacy-preserving Pipelines</w:t>
+      </w:r>
+    </w:p>
+    <w:p>
+      <w:r>
+        <w:t>The ~ privacy marker combined with a pluggable CryptoConfig makes it straightforward to build pipelines where sensitive fields (SSNs, card numbers, PII) travel encrypted end-to-end and are decrypted only at authorised consumers:</w:t>
+      </w:r>
+    </w:p>
+    <w:p>
+      <w:r>
+        <w:t>Producer encrypts on write using RowWriter.writeRow(..., crypto, writer).</w:t>
+      </w:r>
+    </w:p>
+    <w:p>
+      <w:r>
+        <w:t>Producer encrypts on write using RowWriter.writeRow(..., crypto, writer).</w:t>
+      </w:r>
+    </w:p>
+    <w:p>
+      <w:r>
+        <w:t>Pipeline stages validate and transform without ever seeing plaintext.</w:t>
+      </w:r>
+    </w:p>
+    <w:p>
+      <w:r>
+        <w:t>Pipeline stages validate and transform without ever seeing plaintext.</w:t>
+      </w:r>
+    </w:p>
+    <w:p>
+      <w:r>
+        <w:t>Authorised consumer decrypts via transform_with_crypto or on-demand decryptField.</w:t>
+      </w:r>
+    </w:p>
+    <w:p>
+      <w:r>
+        <w:t>Authorised consumer decrypts via transform_with_crypto or on-demand decryptField.</w:t>
+      </w:r>
+    </w:p>
     <w:sectPr>
       <w:pgSz w:w="11906" w:h="16838"/>
       <w:pgMar w:top="1440" w:right="1440" w:bottom="1440" w:left="1440" w:header="708" w:footer="708" w:gutter="0"/>

</xml_diff>